<commit_message>
Day3-FormatTranslator: guard core AI call against failure, add project.md
InvokePromptAsync was unguarded - a bad key, rate limit, or
connectivity blip would crash the whole program. Wraps it in try/catch
matching the Day2 pattern. Syncs the docx's Complete Code listing and
replaces missing.md with project.md.
</commit_message>
<xml_diff>
--- a/Day3-FormatTranslator.docx
+++ b/Day3-FormatTranslator.docx
@@ -133,11 +133,7 @@
         <w:t>Transformation Prompts</w:t>
       </w:r>
       <w:r>
-        <w:t>: Instructing an LLM to act as a data parser rather tha</w:t>
-      </w:r>
-      <w:r>
-        <w:lastRenderedPageBreak/>
-        <w:t>n a conversational partner, using a clear "role" framing ("You are a strict data transformation agent...").</w:t>
+        <w:t>: Instructing an LLM to act as a data parser rather than a conversational partner, using a clear "role" framing ("You are a strict data transformation agent...").</w:t>
       </w:r>
     </w:p>
     <w:p>
@@ -156,7 +152,11 @@
         <w:t>Zero-Hallucination / Negative Constraints</w:t>
       </w:r>
       <w:r>
-        <w:t>: Using explicit phrasing (e.g., "You must NOT output any markdown formatting... Output raw JSON only") to prevent the AI from adding chatty prefixes or wrapping the JSON in a Markdown code fence.</w:t>
+        <w:t xml:space="preserve">: Using explicit phrasing (e.g., "You must NOT output any markdown formatting... Output raw JSON only") to prevent </w:t>
+      </w:r>
+      <w:r>
+        <w:lastRenderedPageBreak/>
+        <w:t>the AI from adding chatty prefixes or wrapping the JSON in a Markdown code fence.</w:t>
       </w:r>
     </w:p>
     <w:p>
@@ -267,1153 +267,1312 @@
           <w:rFonts w:ascii="Consolas" w:hAnsi="Consolas"/>
           <w:sz w:val="19"/>
         </w:rPr>
-        <w:t>// -------------------------------------------------</w:t>
-      </w:r>
+        <w:t>// ---------------------------------------------------------------------------</w:t>
+      </w:r>
+    </w:p>
+    <w:p>
+      <w:pPr>
+        <w:pStyle w:val="NoSpacing"/>
+        <w:rPr>
+          <w:rFonts w:ascii="Consolas" w:hAnsi="Consolas"/>
+          <w:sz w:val="19"/>
+        </w:rPr>
+      </w:pPr>
+      <w:r>
+        <w:rPr>
+          <w:rFonts w:ascii="Consolas" w:hAnsi="Consolas"/>
+          <w:sz w:val="19"/>
+        </w:rPr>
+        <w:t>// A "Transformation Agent" whose only job is turning messy natural language</w:t>
+      </w:r>
+    </w:p>
+    <w:p>
+      <w:pPr>
+        <w:pStyle w:val="NoSpacing"/>
+        <w:rPr>
+          <w:rFonts w:ascii="Consolas" w:hAnsi="Consolas"/>
+          <w:sz w:val="19"/>
+        </w:rPr>
+      </w:pPr>
+      <w:r>
+        <w:rPr>
+          <w:rFonts w:ascii="Consolas" w:hAnsi="Consolas"/>
+          <w:sz w:val="19"/>
+        </w:rPr>
+        <w:t>// into strict, machine-readable JSON. Demonstrates aggressive negative</w:t>
+      </w:r>
+    </w:p>
+    <w:p>
+      <w:pPr>
+        <w:pStyle w:val="NoSpacing"/>
+        <w:rPr>
+          <w:rFonts w:ascii="Consolas" w:hAnsi="Consolas"/>
+          <w:sz w:val="19"/>
+        </w:rPr>
+      </w:pPr>
+      <w:r>
+        <w:rPr>
+          <w:rFonts w:ascii="Consolas" w:hAnsi="Consolas"/>
+          <w:sz w:val="19"/>
+        </w:rPr>
+        <w:t>// prompting (telling the model what NOT to do) plus GeminiPromptExecutionSettings</w:t>
+      </w:r>
+    </w:p>
+    <w:p>
+      <w:pPr>
+        <w:pStyle w:val="NoSpacing"/>
+        <w:rPr>
+          <w:rFonts w:ascii="Consolas" w:hAnsi="Consolas"/>
+          <w:sz w:val="19"/>
+        </w:rPr>
+      </w:pPr>
+      <w:r>
+        <w:rPr>
+          <w:rFonts w:ascii="Consolas" w:hAnsi="Consolas"/>
+          <w:sz w:val="19"/>
+        </w:rPr>
+        <w:t>// (Temperature/TopP) to suppress the model's "creativity" so it behaves like</w:t>
+      </w:r>
+    </w:p>
+    <w:p>
+      <w:pPr>
+        <w:pStyle w:val="NoSpacing"/>
+        <w:rPr>
+          <w:rFonts w:ascii="Consolas" w:hAnsi="Consolas"/>
+          <w:sz w:val="19"/>
+        </w:rPr>
+      </w:pPr>
+      <w:r>
+        <w:rPr>
+          <w:rFonts w:ascii="Consolas" w:hAnsi="Consolas"/>
+          <w:sz w:val="19"/>
+        </w:rPr>
+        <w:t>// a deterministic parser instead of a conversational partner.</w:t>
+      </w:r>
+    </w:p>
+    <w:p>
+      <w:pPr>
+        <w:pStyle w:val="NoSpacing"/>
+        <w:rPr>
+          <w:rFonts w:ascii="Consolas" w:hAnsi="Consolas"/>
+          <w:sz w:val="19"/>
+        </w:rPr>
+      </w:pPr>
+      <w:r>
+        <w:rPr>
+          <w:rFonts w:ascii="Consolas" w:hAnsi="Consolas"/>
+          <w:sz w:val="19"/>
+        </w:rPr>
+        <w:t>using System;</w:t>
+      </w:r>
+    </w:p>
+    <w:p>
+      <w:pPr>
+        <w:pStyle w:val="NoSpacing"/>
+        <w:rPr>
+          <w:rFonts w:ascii="Consolas" w:hAnsi="Consolas"/>
+          <w:sz w:val="19"/>
+        </w:rPr>
+      </w:pPr>
+      <w:r>
+        <w:rPr>
+          <w:rFonts w:ascii="Consolas" w:hAnsi="Consolas"/>
+          <w:sz w:val="19"/>
+        </w:rPr>
+        <w:t>using System.Threading.Tasks;</w:t>
+      </w:r>
+    </w:p>
+    <w:p>
+      <w:pPr>
+        <w:pStyle w:val="NoSpacing"/>
+        <w:rPr>
+          <w:rFonts w:ascii="Consolas" w:hAnsi="Consolas"/>
+          <w:sz w:val="19"/>
+        </w:rPr>
+      </w:pPr>
+      <w:r>
+        <w:rPr>
+          <w:rFonts w:ascii="Consolas" w:hAnsi="Consolas"/>
+          <w:sz w:val="19"/>
+        </w:rPr>
+        <w:t>using Microsoft.SemanticKernel;</w:t>
+      </w:r>
+    </w:p>
+    <w:p>
+      <w:pPr>
+        <w:pStyle w:val="NoSpacing"/>
+        <w:rPr>
+          <w:rFonts w:ascii="Consolas" w:hAnsi="Consolas"/>
+          <w:sz w:val="19"/>
+        </w:rPr>
+      </w:pPr>
+      <w:r>
+        <w:rPr>
+          <w:rFonts w:ascii="Consolas" w:hAnsi="Consolas"/>
+          <w:sz w:val="19"/>
+        </w:rPr>
+        <w:t>using Microsoft.SemanticKernel.Connectors.Google;</w:t>
+      </w:r>
+    </w:p>
+    <w:p>
+      <w:pPr>
+        <w:pStyle w:val="NoSpacing"/>
+        <w:rPr>
+          <w:rFonts w:ascii="Consolas" w:hAnsi="Consolas"/>
+          <w:sz w:val="19"/>
+        </w:rPr>
+      </w:pPr>
+    </w:p>
+    <w:p>
+      <w:pPr>
+        <w:pStyle w:val="NoSpacing"/>
+        <w:rPr>
+          <w:rFonts w:ascii="Consolas" w:hAnsi="Consolas"/>
+          <w:sz w:val="19"/>
+        </w:rPr>
+      </w:pPr>
+      <w:r>
+        <w:rPr>
+          <w:rFonts w:ascii="Consolas" w:hAnsi="Consolas"/>
+          <w:sz w:val="19"/>
+        </w:rPr>
+        <w:t>namespace FormatTranslator</w:t>
+      </w:r>
+    </w:p>
+    <w:p>
+      <w:pPr>
+        <w:pStyle w:val="NoSpacing"/>
+        <w:rPr>
+          <w:rFonts w:ascii="Consolas" w:hAnsi="Consolas"/>
+          <w:sz w:val="19"/>
+        </w:rPr>
+      </w:pPr>
+      <w:r>
+        <w:rPr>
+          <w:rFonts w:ascii="Consolas" w:hAnsi="Consolas"/>
+          <w:sz w:val="19"/>
+        </w:rPr>
+        <w:t>{</w:t>
+      </w:r>
+    </w:p>
+    <w:p>
+      <w:pPr>
+        <w:pStyle w:val="NoSpacing"/>
+        <w:rPr>
+          <w:rFonts w:ascii="Consolas" w:hAnsi="Consolas"/>
+          <w:sz w:val="19"/>
+        </w:rPr>
+      </w:pPr>
+      <w:r>
+        <w:rPr>
+          <w:rFonts w:ascii="Consolas" w:hAnsi="Consolas"/>
+          <w:sz w:val="19"/>
+        </w:rPr>
+        <w:t xml:space="preserve">    class Program</w:t>
+      </w:r>
+    </w:p>
+    <w:p>
+      <w:pPr>
+        <w:pStyle w:val="NoSpacing"/>
+        <w:rPr>
+          <w:rFonts w:ascii="Consolas" w:hAnsi="Consolas"/>
+          <w:sz w:val="19"/>
+        </w:rPr>
+      </w:pPr>
+      <w:r>
+        <w:rPr>
+          <w:rFonts w:ascii="Consolas" w:hAnsi="Consolas"/>
+          <w:sz w:val="19"/>
+        </w:rPr>
+        <w:t xml:space="preserve">    {</w:t>
+      </w:r>
+    </w:p>
+    <w:p>
+      <w:pPr>
+        <w:pStyle w:val="NoSpacing"/>
+        <w:rPr>
+          <w:rFonts w:ascii="Consolas" w:hAnsi="Consolas"/>
+          <w:sz w:val="19"/>
+        </w:rPr>
+      </w:pPr>
+      <w:r>
+        <w:rPr>
+          <w:rFonts w:ascii="Consolas" w:hAnsi="Consolas"/>
+          <w:sz w:val="19"/>
+        </w:rPr>
+        <w:t xml:space="preserve">        static async Task Main(string[] args)</w:t>
+      </w:r>
+    </w:p>
+    <w:p>
+      <w:pPr>
+        <w:pStyle w:val="NoSpacing"/>
+        <w:rPr>
+          <w:rFonts w:ascii="Consolas" w:hAnsi="Consolas"/>
+          <w:sz w:val="19"/>
+        </w:rPr>
+      </w:pPr>
+      <w:r>
+        <w:rPr>
+          <w:rFonts w:ascii="Consolas" w:hAnsi="Consolas"/>
+          <w:sz w:val="19"/>
+        </w:rPr>
+        <w:t xml:space="preserve">        {</w:t>
+      </w:r>
+    </w:p>
+    <w:p>
+      <w:pPr>
+        <w:pStyle w:val="NoSpacing"/>
+        <w:rPr>
+          <w:rFonts w:ascii="Consolas" w:hAnsi="Consolas"/>
+          <w:sz w:val="19"/>
+        </w:rPr>
+      </w:pPr>
+      <w:r>
+        <w:rPr>
+          <w:rFonts w:ascii="Consolas" w:hAnsi="Consolas"/>
+          <w:sz w:val="19"/>
+        </w:rPr>
+        <w:t xml:space="preserve">            // Step 1. Init the kernel with Gemini 2.5 flash</w:t>
+      </w:r>
+    </w:p>
+    <w:p>
+      <w:pPr>
+        <w:pStyle w:val="NoSpacing"/>
+        <w:rPr>
+          <w:rFonts w:ascii="Consolas" w:hAnsi="Consolas"/>
+          <w:sz w:val="19"/>
+        </w:rPr>
+      </w:pPr>
+      <w:r>
+        <w:rPr>
+          <w:rFonts w:ascii="Consolas" w:hAnsi="Consolas"/>
+          <w:sz w:val="19"/>
+        </w:rPr>
+        <w:t xml:space="preserve">            var builder = Kernel.CreateBuilder();</w:t>
+      </w:r>
+    </w:p>
+    <w:p>
+      <w:pPr>
+        <w:pStyle w:val="NoSpacing"/>
+        <w:rPr>
+          <w:rFonts w:ascii="Consolas" w:hAnsi="Consolas"/>
+          <w:sz w:val="19"/>
+        </w:rPr>
+      </w:pPr>
+      <w:r>
+        <w:rPr>
+          <w:rFonts w:ascii="Consolas" w:hAnsi="Consolas"/>
+          <w:sz w:val="19"/>
+        </w:rPr>
+        <w:t xml:space="preserve">            string apiKey = Environment.GetEnvironmentVariable("GEMINI_API_KEY") ?? throw new Exception("GEMINI_API_KEY environment variable is not set.");</w:t>
+      </w:r>
+    </w:p>
+    <w:p>
+      <w:pPr>
+        <w:pStyle w:val="NoSpacing"/>
+        <w:rPr>
+          <w:rFonts w:ascii="Consolas" w:hAnsi="Consolas"/>
+          <w:sz w:val="19"/>
+        </w:rPr>
+      </w:pPr>
+      <w:r>
+        <w:rPr>
+          <w:rFonts w:ascii="Consolas" w:hAnsi="Consolas"/>
+          <w:sz w:val="19"/>
+        </w:rPr>
+        <w:t xml:space="preserve">            string modelId = "gemini-2.5-flash";</w:t>
+      </w:r>
+    </w:p>
+    <w:p>
+      <w:pPr>
+        <w:pStyle w:val="NoSpacing"/>
+        <w:rPr>
+          <w:rFonts w:ascii="Consolas" w:hAnsi="Consolas"/>
+          <w:sz w:val="19"/>
+        </w:rPr>
+      </w:pPr>
+    </w:p>
+    <w:p>
+      <w:pPr>
+        <w:pStyle w:val="NoSpacing"/>
+        <w:rPr>
+          <w:rFonts w:ascii="Consolas" w:hAnsi="Consolas"/>
+          <w:sz w:val="19"/>
+        </w:rPr>
+      </w:pPr>
+      <w:r>
+        <w:rPr>
+          <w:rFonts w:ascii="Consolas" w:hAnsi="Consolas"/>
+          <w:sz w:val="19"/>
+        </w:rPr>
+        <w:t xml:space="preserve">            builder.AddGoogleAIGeminiChatCompletion(modelId, apiKey);</w:t>
+      </w:r>
+    </w:p>
+    <w:p>
+      <w:pPr>
+        <w:pStyle w:val="NoSpacing"/>
+        <w:rPr>
+          <w:rFonts w:ascii="Consolas" w:hAnsi="Consolas"/>
+          <w:sz w:val="19"/>
+        </w:rPr>
+      </w:pPr>
+      <w:r>
+        <w:rPr>
+          <w:rFonts w:ascii="Consolas" w:hAnsi="Consolas"/>
+          <w:sz w:val="19"/>
+        </w:rPr>
+        <w:t xml:space="preserve">            Kernel kernel = builder.Build();</w:t>
+      </w:r>
+    </w:p>
+    <w:p>
+      <w:pPr>
+        <w:pStyle w:val="NoSpacing"/>
+        <w:rPr>
+          <w:rFonts w:ascii="Consolas" w:hAnsi="Consolas"/>
+          <w:sz w:val="19"/>
+        </w:rPr>
+      </w:pPr>
+    </w:p>
+    <w:p>
+      <w:pPr>
+        <w:pStyle w:val="NoSpacing"/>
+        <w:rPr>
+          <w:rFonts w:ascii="Consolas" w:hAnsi="Consolas"/>
+          <w:sz w:val="19"/>
+        </w:rPr>
+      </w:pPr>
+      <w:r>
+        <w:rPr>
+          <w:rFonts w:ascii="Consolas" w:hAnsi="Consolas"/>
+          <w:sz w:val="19"/>
+        </w:rPr>
+        <w:t xml:space="preserve">            // Step 2. Defind the unstrucured input and the prompt template</w:t>
+      </w:r>
+    </w:p>
+    <w:p>
+      <w:pPr>
+        <w:pStyle w:val="NoSpacing"/>
+        <w:rPr>
+          <w:rFonts w:ascii="Consolas" w:hAnsi="Consolas"/>
+          <w:sz w:val="19"/>
+        </w:rPr>
+      </w:pPr>
+      <w:r>
+        <w:rPr>
+          <w:rFonts w:ascii="Consolas" w:hAnsi="Consolas"/>
+          <w:sz w:val="19"/>
+        </w:rPr>
+        <w:t xml:space="preserve">            string unstructuredData = "We just hired Sarah Connor. She is 29 years old, works as a Cybersecurity Analyst, and her email is sarah.c@sky.net. She starts on Monday.";</w:t>
+      </w:r>
+    </w:p>
+    <w:p>
+      <w:pPr>
+        <w:pStyle w:val="NoSpacing"/>
+        <w:rPr>
+          <w:rFonts w:ascii="Consolas" w:hAnsi="Consolas"/>
+          <w:sz w:val="19"/>
+        </w:rPr>
+      </w:pPr>
+    </w:p>
+    <w:p>
+      <w:pPr>
+        <w:pStyle w:val="NoSpacing"/>
+        <w:rPr>
+          <w:rFonts w:ascii="Consolas" w:hAnsi="Consolas"/>
+          <w:sz w:val="19"/>
+        </w:rPr>
+      </w:pPr>
+      <w:r>
+        <w:rPr>
+          <w:rFonts w:ascii="Consolas" w:hAnsi="Consolas"/>
+          <w:sz w:val="19"/>
+        </w:rPr>
+        <w:t xml:space="preserve">            // Step 3. Define the strict prompt template</w:t>
+      </w:r>
+    </w:p>
+    <w:p>
+      <w:pPr>
+        <w:pStyle w:val="NoSpacing"/>
+        <w:rPr>
+          <w:rFonts w:ascii="Consolas" w:hAnsi="Consolas"/>
+          <w:sz w:val="19"/>
+        </w:rPr>
+      </w:pPr>
       <w:r>
         <w:rPr>
           <w:rFonts w:ascii="Consolas" w:hAnsi="Consolas"/>
           <w:sz w:val="19"/>
         </w:rPr>
         <w:lastRenderedPageBreak/>
-        <w:t>--------------------------</w:t>
-      </w:r>
-    </w:p>
-    <w:p>
-      <w:pPr>
-        <w:pStyle w:val="NoSpacing"/>
-        <w:rPr>
-          <w:rFonts w:ascii="Consolas" w:hAnsi="Consolas"/>
-          <w:sz w:val="19"/>
-        </w:rPr>
-      </w:pPr>
-      <w:r>
-        <w:rPr>
-          <w:rFonts w:ascii="Consolas" w:hAnsi="Consolas"/>
-          <w:sz w:val="19"/>
-        </w:rPr>
-        <w:t>// A "Transformation Agent" whose only job is turning messy natural language</w:t>
-      </w:r>
-    </w:p>
-    <w:p>
-      <w:pPr>
-        <w:pStyle w:val="NoSpacing"/>
-        <w:rPr>
-          <w:rFonts w:ascii="Consolas" w:hAnsi="Consolas"/>
-          <w:sz w:val="19"/>
-        </w:rPr>
-      </w:pPr>
-      <w:r>
-        <w:rPr>
-          <w:rFonts w:ascii="Consolas" w:hAnsi="Consolas"/>
-          <w:sz w:val="19"/>
-        </w:rPr>
-        <w:t>// into strict, machine-readable JSON. Demonstrates aggressive negative</w:t>
-      </w:r>
-    </w:p>
-    <w:p>
-      <w:pPr>
-        <w:pStyle w:val="NoSpacing"/>
-        <w:rPr>
-          <w:rFonts w:ascii="Consolas" w:hAnsi="Consolas"/>
-          <w:sz w:val="19"/>
-        </w:rPr>
-      </w:pPr>
-      <w:r>
-        <w:rPr>
-          <w:rFonts w:ascii="Consolas" w:hAnsi="Consolas"/>
-          <w:sz w:val="19"/>
-        </w:rPr>
-        <w:t>// prompting (telling the model what NOT to do) plus GeminiPromptExecutionSettings</w:t>
-      </w:r>
-    </w:p>
-    <w:p>
-      <w:pPr>
-        <w:pStyle w:val="NoSpacing"/>
-        <w:rPr>
-          <w:rFonts w:ascii="Consolas" w:hAnsi="Consolas"/>
-          <w:sz w:val="19"/>
-        </w:rPr>
-      </w:pPr>
-      <w:r>
-        <w:rPr>
-          <w:rFonts w:ascii="Consolas" w:hAnsi="Consolas"/>
-          <w:sz w:val="19"/>
-        </w:rPr>
-        <w:t>// (Temperature/TopP) to suppress the model's "creativity" so it behaves like</w:t>
-      </w:r>
-    </w:p>
-    <w:p>
-      <w:pPr>
-        <w:pStyle w:val="NoSpacing"/>
-        <w:rPr>
-          <w:rFonts w:ascii="Consolas" w:hAnsi="Consolas"/>
-          <w:sz w:val="19"/>
-        </w:rPr>
-      </w:pPr>
-      <w:r>
-        <w:rPr>
-          <w:rFonts w:ascii="Consolas" w:hAnsi="Consolas"/>
-          <w:sz w:val="19"/>
-        </w:rPr>
-        <w:t>// a deterministic parser instead of a conversational partner.</w:t>
-      </w:r>
-    </w:p>
-    <w:p>
-      <w:pPr>
-        <w:pStyle w:val="NoSpacing"/>
-        <w:rPr>
-          <w:rFonts w:ascii="Consolas" w:hAnsi="Consolas"/>
-          <w:sz w:val="19"/>
-        </w:rPr>
-      </w:pPr>
-      <w:r>
-        <w:rPr>
-          <w:rFonts w:ascii="Consolas" w:hAnsi="Consolas"/>
-          <w:sz w:val="19"/>
-        </w:rPr>
-        <w:t>using System;</w:t>
-      </w:r>
-    </w:p>
-    <w:p>
-      <w:pPr>
-        <w:pStyle w:val="NoSpacing"/>
-        <w:rPr>
-          <w:rFonts w:ascii="Consolas" w:hAnsi="Consolas"/>
-          <w:sz w:val="19"/>
-        </w:rPr>
-      </w:pPr>
-      <w:r>
-        <w:rPr>
-          <w:rFonts w:ascii="Consolas" w:hAnsi="Consolas"/>
-          <w:sz w:val="19"/>
-        </w:rPr>
-        <w:t>using System.Threading.Tasks;</w:t>
-      </w:r>
-    </w:p>
-    <w:p>
-      <w:pPr>
-        <w:pStyle w:val="NoSpacing"/>
-        <w:rPr>
-          <w:rFonts w:ascii="Consolas" w:hAnsi="Consolas"/>
-          <w:sz w:val="19"/>
-        </w:rPr>
-      </w:pPr>
-      <w:r>
-        <w:rPr>
-          <w:rFonts w:ascii="Consolas" w:hAnsi="Consolas"/>
-          <w:sz w:val="19"/>
-        </w:rPr>
-        <w:t>using Microsoft.SemanticKernel;</w:t>
-      </w:r>
-    </w:p>
-    <w:p>
-      <w:pPr>
-        <w:pStyle w:val="NoSpacing"/>
-        <w:rPr>
-          <w:rFonts w:ascii="Consolas" w:hAnsi="Consolas"/>
-          <w:sz w:val="19"/>
-        </w:rPr>
-      </w:pPr>
-      <w:r>
-        <w:rPr>
-          <w:rFonts w:ascii="Consolas" w:hAnsi="Consolas"/>
-          <w:sz w:val="19"/>
-        </w:rPr>
-        <w:t>using Microsoft.SemanticKernel.Connectors.Google;</w:t>
-      </w:r>
-    </w:p>
-    <w:p>
-      <w:pPr>
-        <w:pStyle w:val="NoSpacing"/>
-        <w:rPr>
-          <w:rFonts w:ascii="Consolas" w:hAnsi="Consolas"/>
-          <w:sz w:val="19"/>
-        </w:rPr>
-      </w:pPr>
-    </w:p>
-    <w:p>
-      <w:pPr>
-        <w:pStyle w:val="NoSpacing"/>
-        <w:rPr>
-          <w:rFonts w:ascii="Consolas" w:hAnsi="Consolas"/>
-          <w:sz w:val="19"/>
-        </w:rPr>
-      </w:pPr>
-      <w:r>
-        <w:rPr>
-          <w:rFonts w:ascii="Consolas" w:hAnsi="Consolas"/>
-          <w:sz w:val="19"/>
-        </w:rPr>
-        <w:t>namespace FormatTranslator</w:t>
-      </w:r>
-    </w:p>
-    <w:p>
-      <w:pPr>
-        <w:pStyle w:val="NoSpacing"/>
-        <w:rPr>
-          <w:rFonts w:ascii="Consolas" w:hAnsi="Consolas"/>
-          <w:sz w:val="19"/>
-        </w:rPr>
-      </w:pPr>
-      <w:r>
-        <w:rPr>
-          <w:rFonts w:ascii="Consolas" w:hAnsi="Consolas"/>
-          <w:sz w:val="19"/>
-        </w:rPr>
-        <w:t>{</w:t>
-      </w:r>
-    </w:p>
-    <w:p>
-      <w:pPr>
-        <w:pStyle w:val="NoSpacing"/>
-        <w:rPr>
-          <w:rFonts w:ascii="Consolas" w:hAnsi="Consolas"/>
-          <w:sz w:val="19"/>
-        </w:rPr>
-      </w:pPr>
-      <w:r>
-        <w:rPr>
-          <w:rFonts w:ascii="Consolas" w:hAnsi="Consolas"/>
-          <w:sz w:val="19"/>
-        </w:rPr>
-        <w:t xml:space="preserve">    class Program</w:t>
-      </w:r>
-    </w:p>
-    <w:p>
-      <w:pPr>
-        <w:pStyle w:val="NoSpacing"/>
-        <w:rPr>
-          <w:rFonts w:ascii="Consolas" w:hAnsi="Consolas"/>
-          <w:sz w:val="19"/>
-        </w:rPr>
-      </w:pPr>
-      <w:r>
-        <w:rPr>
-          <w:rFonts w:ascii="Consolas" w:hAnsi="Consolas"/>
-          <w:sz w:val="19"/>
-        </w:rPr>
-        <w:t xml:space="preserve">    {</w:t>
-      </w:r>
-    </w:p>
-    <w:p>
-      <w:pPr>
-        <w:pStyle w:val="NoSpacing"/>
-        <w:rPr>
-          <w:rFonts w:ascii="Consolas" w:hAnsi="Consolas"/>
-          <w:sz w:val="19"/>
-        </w:rPr>
-      </w:pPr>
-      <w:r>
-        <w:rPr>
-          <w:rFonts w:ascii="Consolas" w:hAnsi="Consolas"/>
-          <w:sz w:val="19"/>
-        </w:rPr>
-        <w:t xml:space="preserve">        static async Task Main(string[] args)</w:t>
-      </w:r>
-    </w:p>
-    <w:p>
-      <w:pPr>
-        <w:pStyle w:val="NoSpacing"/>
-        <w:rPr>
-          <w:rFonts w:ascii="Consolas" w:hAnsi="Consolas"/>
-          <w:sz w:val="19"/>
-        </w:rPr>
-      </w:pPr>
-      <w:r>
-        <w:rPr>
-          <w:rFonts w:ascii="Consolas" w:hAnsi="Consolas"/>
-          <w:sz w:val="19"/>
-        </w:rPr>
-        <w:t xml:space="preserve">        {</w:t>
-      </w:r>
-    </w:p>
-    <w:p>
-      <w:pPr>
-        <w:pStyle w:val="NoSpacing"/>
-        <w:rPr>
-          <w:rFonts w:ascii="Consolas" w:hAnsi="Consolas"/>
-          <w:sz w:val="19"/>
-        </w:rPr>
-      </w:pPr>
-      <w:r>
-        <w:rPr>
-          <w:rFonts w:ascii="Consolas" w:hAnsi="Consolas"/>
-          <w:sz w:val="19"/>
-        </w:rPr>
-        <w:t xml:space="preserve">            // Step 1. Init the kernel with Gemini 2.5 flash</w:t>
-      </w:r>
-    </w:p>
-    <w:p>
-      <w:pPr>
-        <w:pStyle w:val="NoSpacing"/>
-        <w:rPr>
-          <w:rFonts w:ascii="Consolas" w:hAnsi="Consolas"/>
-          <w:sz w:val="19"/>
-        </w:rPr>
-      </w:pPr>
-      <w:r>
-        <w:rPr>
-          <w:rFonts w:ascii="Consolas" w:hAnsi="Consolas"/>
-          <w:sz w:val="19"/>
-        </w:rPr>
-        <w:t xml:space="preserve">            var builder = Kernel.CreateBuilder();</w:t>
-      </w:r>
-    </w:p>
-    <w:p>
-      <w:pPr>
-        <w:pStyle w:val="NoSpacing"/>
-        <w:rPr>
-          <w:rFonts w:ascii="Consolas" w:hAnsi="Consolas"/>
-          <w:sz w:val="19"/>
-        </w:rPr>
-      </w:pPr>
-      <w:r>
-        <w:rPr>
-          <w:rFonts w:ascii="Consolas" w:hAnsi="Consolas"/>
-          <w:sz w:val="19"/>
-        </w:rPr>
-        <w:t xml:space="preserve">            string apiKey = Environment.GetEnvironmentVariable("GEMINI_API_KEY") ?? throw new Exception("GEMINI_API_KEY environment variable is not set.");</w:t>
-      </w:r>
-    </w:p>
-    <w:p>
-      <w:pPr>
-        <w:pStyle w:val="NoSpacing"/>
-        <w:rPr>
-          <w:rFonts w:ascii="Consolas" w:hAnsi="Consolas"/>
-          <w:sz w:val="19"/>
-        </w:rPr>
-      </w:pPr>
-      <w:r>
-        <w:rPr>
-          <w:rFonts w:ascii="Consolas" w:hAnsi="Consolas"/>
-          <w:sz w:val="19"/>
-        </w:rPr>
-        <w:t xml:space="preserve">  </w:t>
-      </w:r>
-      <w:r>
-        <w:rPr>
-          <w:rFonts w:ascii="Consolas" w:hAnsi="Consolas"/>
-          <w:sz w:val="19"/>
-        </w:rPr>
+        <w:t xml:space="preserve">            // We explicitly ban markdown blocks and converssational text to ensure raw JSON output</w:t>
+      </w:r>
+    </w:p>
+    <w:p>
+      <w:pPr>
+        <w:pStyle w:val="NoSpacing"/>
+        <w:rPr>
+          <w:rFonts w:ascii="Consolas" w:hAnsi="Consolas"/>
+          <w:sz w:val="19"/>
+        </w:rPr>
+      </w:pPr>
+      <w:r>
+        <w:rPr>
+          <w:rFonts w:ascii="Consolas" w:hAnsi="Consolas"/>
+          <w:sz w:val="19"/>
+        </w:rPr>
+        <w:t xml:space="preserve">            string promptTemplate = @"</w:t>
+      </w:r>
+    </w:p>
+    <w:p>
+      <w:pPr>
+        <w:pStyle w:val="NoSpacing"/>
+        <w:rPr>
+          <w:rFonts w:ascii="Consolas" w:hAnsi="Consolas"/>
+          <w:sz w:val="19"/>
+        </w:rPr>
+      </w:pPr>
+      <w:r>
+        <w:rPr>
+          <w:rFonts w:ascii="Consolas" w:hAnsi="Consolas"/>
+          <w:sz w:val="19"/>
+        </w:rPr>
+        <w:t>System: You are a strict data transformation agent. Your ONLY job is to convert natural language text into a valid JSON object.</w:t>
+      </w:r>
+    </w:p>
+    <w:p>
+      <w:pPr>
+        <w:pStyle w:val="NoSpacing"/>
+        <w:rPr>
+          <w:rFonts w:ascii="Consolas" w:hAnsi="Consolas"/>
+          <w:sz w:val="19"/>
+        </w:rPr>
+      </w:pPr>
+      <w:r>
+        <w:rPr>
+          <w:rFonts w:ascii="Consolas" w:hAnsi="Consolas"/>
+          <w:sz w:val="19"/>
+        </w:rPr>
+        <w:t>You must NOT output any markdown formatting (like ```json), no conversational text, and no explanations. Output raw JSON only.</w:t>
+      </w:r>
+    </w:p>
+    <w:p>
+      <w:pPr>
+        <w:pStyle w:val="NoSpacing"/>
+        <w:rPr>
+          <w:rFonts w:ascii="Consolas" w:hAnsi="Consolas"/>
+          <w:sz w:val="19"/>
+        </w:rPr>
+      </w:pPr>
+    </w:p>
+    <w:p>
+      <w:pPr>
+        <w:pStyle w:val="NoSpacing"/>
+        <w:rPr>
+          <w:rFonts w:ascii="Consolas" w:hAnsi="Consolas"/>
+          <w:sz w:val="19"/>
+        </w:rPr>
+      </w:pPr>
+      <w:r>
+        <w:rPr>
+          <w:rFonts w:ascii="Consolas" w:hAnsi="Consolas"/>
+          <w:sz w:val="19"/>
+        </w:rPr>
+        <w:t>The JSON must have the exact following keys:</w:t>
+      </w:r>
+    </w:p>
+    <w:p>
+      <w:pPr>
+        <w:pStyle w:val="NoSpacing"/>
+        <w:rPr>
+          <w:rFonts w:ascii="Consolas" w:hAnsi="Consolas"/>
+          <w:sz w:val="19"/>
+        </w:rPr>
+      </w:pPr>
+      <w:r>
+        <w:rPr>
+          <w:rFonts w:ascii="Consolas" w:hAnsi="Consolas"/>
+          <w:sz w:val="19"/>
+        </w:rPr>
+        <w:t>- FirstName (string)</w:t>
+      </w:r>
+    </w:p>
+    <w:p>
+      <w:pPr>
+        <w:pStyle w:val="NoSpacing"/>
+        <w:rPr>
+          <w:rFonts w:ascii="Consolas" w:hAnsi="Consolas"/>
+          <w:sz w:val="19"/>
+        </w:rPr>
+      </w:pPr>
+      <w:r>
+        <w:rPr>
+          <w:rFonts w:ascii="Consolas" w:hAnsi="Consolas"/>
+          <w:sz w:val="19"/>
+        </w:rPr>
+        <w:t>- LastName (string)</w:t>
+      </w:r>
+    </w:p>
+    <w:p>
+      <w:pPr>
+        <w:pStyle w:val="NoSpacing"/>
+        <w:rPr>
+          <w:rFonts w:ascii="Consolas" w:hAnsi="Consolas"/>
+          <w:sz w:val="19"/>
+        </w:rPr>
+      </w:pPr>
+      <w:r>
+        <w:rPr>
+          <w:rFonts w:ascii="Consolas" w:hAnsi="Consolas"/>
+          <w:sz w:val="19"/>
+        </w:rPr>
+        <w:t>- Age (integer)</w:t>
+      </w:r>
+    </w:p>
+    <w:p>
+      <w:pPr>
+        <w:pStyle w:val="NoSpacing"/>
+        <w:rPr>
+          <w:rFonts w:ascii="Consolas" w:hAnsi="Consolas"/>
+          <w:sz w:val="19"/>
+        </w:rPr>
+      </w:pPr>
+      <w:r>
+        <w:rPr>
+          <w:rFonts w:ascii="Consolas" w:hAnsi="Consolas"/>
+          <w:sz w:val="19"/>
+        </w:rPr>
+        <w:t>- JobTitle (string)</w:t>
+      </w:r>
+    </w:p>
+    <w:p>
+      <w:pPr>
+        <w:pStyle w:val="NoSpacing"/>
+        <w:rPr>
+          <w:rFonts w:ascii="Consolas" w:hAnsi="Consolas"/>
+          <w:sz w:val="19"/>
+        </w:rPr>
+      </w:pPr>
+      <w:r>
+        <w:rPr>
+          <w:rFonts w:ascii="Consolas" w:hAnsi="Consolas"/>
+          <w:sz w:val="19"/>
+        </w:rPr>
+        <w:t>- Email (string)</w:t>
+      </w:r>
+    </w:p>
+    <w:p>
+      <w:pPr>
+        <w:pStyle w:val="NoSpacing"/>
+        <w:rPr>
+          <w:rFonts w:ascii="Consolas" w:hAnsi="Consolas"/>
+          <w:sz w:val="19"/>
+        </w:rPr>
+      </w:pPr>
+    </w:p>
+    <w:p>
+      <w:pPr>
+        <w:pStyle w:val="NoSpacing"/>
+        <w:rPr>
+          <w:rFonts w:ascii="Consolas" w:hAnsi="Consolas"/>
+          <w:sz w:val="19"/>
+        </w:rPr>
+      </w:pPr>
+      <w:r>
+        <w:rPr>
+          <w:rFonts w:ascii="Consolas" w:hAnsi="Consolas"/>
+          <w:sz w:val="19"/>
+        </w:rPr>
+        <w:t>User: Translate this text into JSON:</w:t>
+      </w:r>
+    </w:p>
+    <w:p>
+      <w:pPr>
+        <w:pStyle w:val="NoSpacing"/>
+        <w:rPr>
+          <w:rFonts w:ascii="Consolas" w:hAnsi="Consolas"/>
+          <w:sz w:val="19"/>
+        </w:rPr>
+      </w:pPr>
+      <w:r>
+        <w:rPr>
+          <w:rFonts w:ascii="Consolas" w:hAnsi="Consolas"/>
+          <w:sz w:val="19"/>
+        </w:rPr>
+        <w:t>{{$input}}</w:t>
+      </w:r>
+    </w:p>
+    <w:p>
+      <w:pPr>
+        <w:pStyle w:val="NoSpacing"/>
+        <w:rPr>
+          <w:rFonts w:ascii="Consolas" w:hAnsi="Consolas"/>
+          <w:sz w:val="19"/>
+        </w:rPr>
+      </w:pPr>
+      <w:r>
+        <w:rPr>
+          <w:rFonts w:ascii="Consolas" w:hAnsi="Consolas"/>
+          <w:sz w:val="19"/>
+        </w:rPr>
+        <w:t>";</w:t>
+      </w:r>
+    </w:p>
+    <w:p>
+      <w:pPr>
+        <w:pStyle w:val="NoSpacing"/>
+        <w:rPr>
+          <w:rFonts w:ascii="Consolas" w:hAnsi="Consolas"/>
+          <w:sz w:val="19"/>
+        </w:rPr>
+      </w:pPr>
+      <w:r>
+        <w:rPr>
+          <w:rFonts w:ascii="Consolas" w:hAnsi="Consolas"/>
+          <w:sz w:val="19"/>
+        </w:rPr>
+        <w:t xml:space="preserve">            // Step 4. Configure Execution Settings to eliminate creativity</w:t>
+      </w:r>
+    </w:p>
+    <w:p>
+      <w:pPr>
+        <w:pStyle w:val="NoSpacing"/>
+        <w:rPr>
+          <w:rFonts w:ascii="Consolas" w:hAnsi="Consolas"/>
+          <w:sz w:val="19"/>
+        </w:rPr>
+      </w:pPr>
+      <w:r>
+        <w:rPr>
+          <w:rFonts w:ascii="Consolas" w:hAnsi="Consolas"/>
+          <w:sz w:val="19"/>
+        </w:rPr>
+        <w:t xml:space="preserve">            var executionSettings = new GeminiPromptExecutionSettings()</w:t>
+      </w:r>
+    </w:p>
+    <w:p>
+      <w:pPr>
+        <w:pStyle w:val="NoSpacing"/>
+        <w:rPr>
+          <w:rFonts w:ascii="Consolas" w:hAnsi="Consolas"/>
+          <w:sz w:val="19"/>
+        </w:rPr>
+      </w:pPr>
+      <w:r>
+        <w:rPr>
+          <w:rFonts w:ascii="Consolas" w:hAnsi="Consolas"/>
+          <w:sz w:val="19"/>
+        </w:rPr>
+        <w:t xml:space="preserve">            {</w:t>
+      </w:r>
+    </w:p>
+    <w:p>
+      <w:pPr>
+        <w:pStyle w:val="NoSpacing"/>
+        <w:rPr>
+          <w:rFonts w:ascii="Consolas" w:hAnsi="Consolas"/>
+          <w:sz w:val="19"/>
+        </w:rPr>
+      </w:pPr>
+      <w:r>
+        <w:rPr>
+          <w:rFonts w:ascii="Consolas" w:hAnsi="Consolas"/>
+          <w:sz w:val="19"/>
+        </w:rPr>
+        <w:t xml:space="preserve">                Temperature = 0.0, // Eliminate randomness</w:t>
+      </w:r>
+    </w:p>
+    <w:p>
+      <w:pPr>
+        <w:pStyle w:val="NoSpacing"/>
+        <w:rPr>
+          <w:rFonts w:ascii="Consolas" w:hAnsi="Consolas"/>
+          <w:sz w:val="19"/>
+        </w:rPr>
+      </w:pPr>
+      <w:r>
+        <w:rPr>
+          <w:rFonts w:ascii="Consolas" w:hAnsi="Consolas"/>
+          <w:sz w:val="19"/>
+        </w:rPr>
+        <w:t xml:space="preserve">                TopP = 0.1</w:t>
+      </w:r>
+    </w:p>
+    <w:p>
+      <w:pPr>
+        <w:pStyle w:val="NoSpacing"/>
+        <w:rPr>
+          <w:rFonts w:ascii="Consolas" w:hAnsi="Consolas"/>
+          <w:sz w:val="19"/>
+        </w:rPr>
+      </w:pPr>
+      <w:r>
+        <w:rPr>
+          <w:rFonts w:ascii="Consolas" w:hAnsi="Consolas"/>
+          <w:sz w:val="19"/>
+        </w:rPr>
+        <w:t xml:space="preserve">            };</w:t>
+      </w:r>
+    </w:p>
+    <w:p>
+      <w:pPr>
+        <w:pStyle w:val="NoSpacing"/>
+        <w:rPr>
+          <w:rFonts w:ascii="Consolas" w:hAnsi="Consolas"/>
+          <w:sz w:val="19"/>
+        </w:rPr>
+      </w:pPr>
+    </w:p>
+    <w:p>
+      <w:pPr>
+        <w:pStyle w:val="NoSpacing"/>
+        <w:rPr>
+          <w:rFonts w:ascii="Consolas" w:hAnsi="Consolas"/>
+          <w:sz w:val="19"/>
+        </w:rPr>
+      </w:pPr>
+      <w:r>
+        <w:rPr>
+          <w:rFonts w:ascii="Consolas" w:hAnsi="Consolas"/>
+          <w:sz w:val="19"/>
+        </w:rPr>
+        <w:t xml:space="preserve">            // Step 5. Execute the prompt with the unstructured input</w:t>
+      </w:r>
+    </w:p>
+    <w:p>
+      <w:pPr>
+        <w:pStyle w:val="NoSpacing"/>
+        <w:rPr>
+          <w:rFonts w:ascii="Consolas" w:hAnsi="Consolas"/>
+          <w:sz w:val="19"/>
+        </w:rPr>
+      </w:pPr>
+      <w:r>
+        <w:rPr>
+          <w:rFonts w:ascii="Consolas" w:hAnsi="Consolas"/>
+          <w:sz w:val="19"/>
+        </w:rPr>
+        <w:t xml:space="preserve">            var arguments = new KernelArguments(executionSettings)</w:t>
+      </w:r>
+    </w:p>
+    <w:p>
+      <w:pPr>
+        <w:pStyle w:val="NoSpacing"/>
+        <w:rPr>
+          <w:rFonts w:ascii="Consolas" w:hAnsi="Consolas"/>
+          <w:sz w:val="19"/>
+        </w:rPr>
+      </w:pPr>
+      <w:r>
+        <w:rPr>
+          <w:rFonts w:ascii="Consolas" w:hAnsi="Consolas"/>
+          <w:sz w:val="19"/>
+        </w:rPr>
+        <w:t xml:space="preserve">            {</w:t>
+      </w:r>
+    </w:p>
+    <w:p>
+      <w:pPr>
+        <w:pStyle w:val="NoSpacing"/>
+        <w:rPr>
+          <w:rFonts w:ascii="Consolas" w:hAnsi="Consolas"/>
+          <w:sz w:val="19"/>
+        </w:rPr>
+      </w:pPr>
+      <w:r>
+        <w:rPr>
+          <w:rFonts w:ascii="Consolas" w:hAnsi="Consolas"/>
+          <w:sz w:val="19"/>
+        </w:rPr>
+        <w:t xml:space="preserve">                {  "input", unstructuredData }</w:t>
+      </w:r>
+    </w:p>
+    <w:p>
+      <w:pPr>
+        <w:pStyle w:val="NoSpacing"/>
+        <w:rPr>
+          <w:rFonts w:ascii="Consolas" w:hAnsi="Consolas"/>
+          <w:sz w:val="19"/>
+        </w:rPr>
+      </w:pPr>
+      <w:r>
+        <w:rPr>
+          <w:rFonts w:ascii="Consolas" w:hAnsi="Consolas"/>
+          <w:sz w:val="19"/>
+        </w:rPr>
+        <w:t xml:space="preserve">            };</w:t>
+      </w:r>
+    </w:p>
+    <w:p>
+      <w:pPr>
+        <w:pStyle w:val="NoSpacing"/>
+        <w:rPr>
+          <w:rFonts w:ascii="Consolas" w:hAnsi="Consolas"/>
+          <w:sz w:val="19"/>
+        </w:rPr>
+      </w:pPr>
+    </w:p>
+    <w:p>
+      <w:pPr>
+        <w:pStyle w:val="NoSpacing"/>
+        <w:rPr>
+          <w:rFonts w:ascii="Consolas" w:hAnsi="Consolas"/>
+          <w:sz w:val="19"/>
+        </w:rPr>
+      </w:pPr>
+      <w:r>
+        <w:rPr>
+          <w:rFonts w:ascii="Consolas" w:hAnsi="Consolas"/>
+          <w:sz w:val="19"/>
+        </w:rPr>
+        <w:t xml:space="preserve">            Console.WriteLine("Input Data:");</w:t>
+      </w:r>
+    </w:p>
+    <w:p>
+      <w:pPr>
+        <w:pStyle w:val="NoSpacing"/>
+        <w:rPr>
+          <w:rFonts w:ascii="Consolas" w:hAnsi="Consolas"/>
+          <w:sz w:val="19"/>
+        </w:rPr>
+      </w:pPr>
+      <w:r>
+        <w:rPr>
+          <w:rFonts w:ascii="Consolas" w:hAnsi="Consolas"/>
+          <w:sz w:val="19"/>
+        </w:rPr>
+        <w:t xml:space="preserve">            Console.WriteLine(unstructuredData);</w:t>
+      </w:r>
+    </w:p>
+    <w:p>
+      <w:pPr>
+        <w:pStyle w:val="NoSpacing"/>
+        <w:rPr>
+          <w:rFonts w:ascii="Consolas" w:hAnsi="Consolas"/>
+          <w:sz w:val="19"/>
+        </w:rPr>
+      </w:pPr>
+      <w:r>
+        <w:rPr>
+          <w:rFonts w:ascii="Consolas" w:hAnsi="Consolas"/>
+          <w:sz w:val="19"/>
+        </w:rPr>
+        <w:t xml:space="preserve">            Console.WriteLine("Transformatin natural language to JSON...");</w:t>
+      </w:r>
+    </w:p>
+    <w:p>
+      <w:pPr>
+        <w:pStyle w:val="NoSpacing"/>
+        <w:rPr>
+          <w:rFonts w:ascii="Consolas" w:hAnsi="Consolas"/>
+          <w:sz w:val="19"/>
+        </w:rPr>
+      </w:pPr>
+    </w:p>
+    <w:p>
+      <w:pPr>
+        <w:pStyle w:val="NoSpacing"/>
+        <w:rPr>
+          <w:rFonts w:ascii="Consolas" w:hAnsi="Consolas"/>
+          <w:sz w:val="19"/>
+        </w:rPr>
+      </w:pPr>
+      <w:r>
+        <w:rPr>
+          <w:rFonts w:ascii="Consolas" w:hAnsi="Consolas"/>
+          <w:sz w:val="19"/>
+        </w:rPr>
+        <w:t xml:space="preserve">            // Step 6. Execute the prompt. Wrapped in try/catch because this is</w:t>
+      </w:r>
+    </w:p>
+    <w:p>
+      <w:pPr>
+        <w:pStyle w:val="NoSpacing"/>
+        <w:rPr>
+          <w:rFonts w:ascii="Consolas" w:hAnsi="Consolas"/>
+          <w:sz w:val="19"/>
+        </w:rPr>
+      </w:pPr>
+      <w:r>
+        <w:rPr>
+          <w:rFonts w:ascii="Consolas" w:hAnsi="Consolas"/>
+          <w:sz w:val="19"/>
+        </w:rPr>
+        <w:t xml:space="preserve">            // the network call to the model - a bad key, rate limit, or</w:t>
+      </w:r>
+    </w:p>
+    <w:p>
+      <w:pPr>
+        <w:pStyle w:val="NoSpacing"/>
+        <w:rPr>
+          <w:rFonts w:ascii="Consolas" w:hAnsi="Consolas"/>
+          <w:sz w:val="19"/>
+        </w:rPr>
+      </w:pPr>
+      <w:r>
+        <w:rPr>
+          <w:rFonts w:ascii="Consolas" w:hAnsi="Consolas"/>
+          <w:sz w:val="19"/>
+        </w:rPr>
+        <w:t xml:space="preserve">            // connectivity blip would otherwise crash the whole program with</w:t>
+      </w:r>
+    </w:p>
+    <w:p>
+      <w:pPr>
+        <w:pStyle w:val="NoSpacing"/>
+        <w:rPr>
+          <w:rFonts w:ascii="Consolas" w:hAnsi="Consolas"/>
+          <w:sz w:val="19"/>
+        </w:rPr>
+      </w:pPr>
+      <w:r>
+        <w:rPr>
+          <w:rFonts w:ascii="Consolas" w:hAnsi="Consolas"/>
+          <w:sz w:val="19"/>
+        </w:rPr>
+        <w:t xml:space="preserve">            // a raw stack trace instead of a readable message.</w:t>
+      </w:r>
+    </w:p>
+    <w:p>
+      <w:pPr>
+        <w:pStyle w:val="NoSpacing"/>
+        <w:rPr>
+          <w:rFonts w:ascii="Consolas" w:hAnsi="Consolas"/>
+          <w:sz w:val="19"/>
+        </w:rPr>
+      </w:pPr>
+      <w:r>
+        <w:rPr>
+          <w:rFonts w:ascii="Consolas" w:hAnsi="Consolas"/>
+          <w:sz w:val="19"/>
+        </w:rPr>
+        <w:t xml:space="preserve">            try</w:t>
+      </w:r>
+    </w:p>
+    <w:p>
+      <w:pPr>
+        <w:pStyle w:val="NoSpacing"/>
+        <w:rPr>
+          <w:rFonts w:ascii="Consolas" w:hAnsi="Consolas"/>
+          <w:sz w:val="19"/>
+        </w:rPr>
+      </w:pPr>
+      <w:r>
+        <w:rPr>
+          <w:rFonts w:ascii="Consolas" w:hAnsi="Consolas"/>
+          <w:sz w:val="19"/>
+        </w:rPr>
+        <w:t xml:space="preserve">            {</w:t>
+      </w:r>
+    </w:p>
+    <w:p>
+      <w:pPr>
+        <w:pStyle w:val="NoSpacing"/>
+        <w:rPr>
+          <w:rFonts w:ascii="Consolas" w:hAnsi="Consolas"/>
+          <w:sz w:val="19"/>
+        </w:rPr>
+      </w:pPr>
+      <w:r>
+        <w:rPr>
+          <w:rFonts w:ascii="Consolas" w:hAnsi="Consolas"/>
+          <w:sz w:val="19"/>
+        </w:rPr>
+        <w:t xml:space="preserve">                var result = await kernel.InvokePromptAsync(promptTemplate, arguments);</w:t>
+      </w:r>
+    </w:p>
+    <w:p>
+      <w:pPr>
+        <w:pStyle w:val="NoSpacing"/>
+        <w:rPr>
+          <w:rFonts w:ascii="Consolas" w:hAnsi="Consolas"/>
+          <w:sz w:val="19"/>
+        </w:rPr>
+      </w:pPr>
+    </w:p>
+    <w:p>
+      <w:pPr>
+        <w:pStyle w:val="NoSpacing"/>
+        <w:rPr>
+          <w:rFonts w:ascii="Consolas" w:hAnsi="Consolas"/>
+          <w:sz w:val="19"/>
+        </w:rPr>
+      </w:pPr>
+      <w:r>
+        <w:rPr>
+          <w:rFonts w:ascii="Consolas" w:hAnsi="Consolas"/>
+          <w:sz w:val="19"/>
+        </w:rPr>
+        <w:t xml:space="preserve">                // Step 7. Output the result</w:t>
+      </w:r>
+    </w:p>
+    <w:p>
+      <w:pPr>
+        <w:pStyle w:val="NoSpacing"/>
+        <w:rPr>
+          <w:rFonts w:ascii="Consolas" w:hAnsi="Consolas"/>
+          <w:sz w:val="19"/>
+        </w:rPr>
+      </w:pPr>
+      <w:r>
+        <w:rPr>
+          <w:rFonts w:ascii="Consolas" w:hAnsi="Consolas"/>
+          <w:sz w:val="19"/>
+        </w:rPr>
+        <w:t xml:space="preserve">                </w:t>
+      </w:r>
+      <w:r>
+        <w:rPr>
+          <w:rFonts w:ascii="Consolas" w:hAnsi="Consolas"/>
+          <w:sz w:val="19"/>
+        </w:rPr>
+        <w:t>Console.WriteLine("--- STRING JSON OUTPUT ---");</w:t>
+      </w:r>
+    </w:p>
+    <w:p>
+      <w:pPr>
+        <w:pStyle w:val="NoSpacing"/>
+        <w:rPr>
+          <w:rFonts w:ascii="Consolas" w:hAnsi="Consolas"/>
+          <w:sz w:val="19"/>
+        </w:rPr>
+      </w:pPr>
+      <w:r>
+        <w:rPr>
+          <w:rFonts w:ascii="Consolas" w:hAnsi="Consolas"/>
+          <w:sz w:val="19"/>
+        </w:rPr>
+        <w:t xml:space="preserve">                Console.WriteLine(result.ToString());</w:t>
+      </w:r>
+    </w:p>
+    <w:p>
+      <w:pPr>
+        <w:pStyle w:val="NoSpacing"/>
+        <w:rPr>
+          <w:rFonts w:ascii="Consolas" w:hAnsi="Consolas"/>
+          <w:sz w:val="19"/>
+        </w:rPr>
+      </w:pPr>
+      <w:r>
+        <w:rPr>
+          <w:rFonts w:ascii="Consolas" w:hAnsi="Consolas"/>
+          <w:sz w:val="19"/>
+        </w:rPr>
+        <w:t xml:space="preserve">                </w:t>
+      </w:r>
+      <w:r>
+        <w:rPr>
+          <w:rFonts w:ascii="Consolas" w:hAnsi="Consolas"/>
+          <w:sz w:val="19"/>
+        </w:rPr>
+        <w:t>Console.WriteLine("--------------------------");</w:t>
+      </w:r>
+    </w:p>
+    <w:p>
+      <w:pPr>
+        <w:pStyle w:val="NoSpacing"/>
+        <w:rPr>
+          <w:rFonts w:ascii="Consolas" w:hAnsi="Consolas"/>
+          <w:sz w:val="19"/>
+        </w:rPr>
+      </w:pPr>
+      <w:r>
+        <w:rPr>
+          <w:rFonts w:ascii="Consolas" w:hAnsi="Consolas"/>
+          <w:sz w:val="19"/>
+        </w:rPr>
+        <w:t xml:space="preserve">            }</w:t>
+      </w:r>
+    </w:p>
+    <w:p>
+      <w:pPr>
+        <w:pStyle w:val="NoSpacing"/>
+        <w:rPr>
+          <w:rFonts w:ascii="Consolas" w:hAnsi="Consolas"/>
+          <w:sz w:val="19"/>
+        </w:rPr>
+      </w:pPr>
+      <w:r>
+        <w:rPr>
+          <w:rFonts w:ascii="Consolas" w:hAnsi="Consolas"/>
+          <w:sz w:val="19"/>
+        </w:rPr>
+        <w:t xml:space="preserve">            catch (Exception ex)</w:t>
+      </w:r>
+    </w:p>
+    <w:p>
+      <w:pPr>
+        <w:pStyle w:val="NoSpacing"/>
+        <w:rPr>
+          <w:rFonts w:ascii="Consolas" w:hAnsi="Consolas"/>
+          <w:sz w:val="19"/>
+        </w:rPr>
+      </w:pPr>
+      <w:r>
+        <w:rPr>
+          <w:rFonts w:ascii="Consolas" w:hAnsi="Consolas"/>
+          <w:sz w:val="19"/>
+        </w:rPr>
+        <w:t xml:space="preserve">            {</w:t>
+      </w:r>
+    </w:p>
+    <w:p>
+      <w:pPr>
+        <w:pStyle w:val="NoSpacing"/>
+        <w:rPr>
+          <w:rFonts w:ascii="Consolas" w:hAnsi="Consolas"/>
+          <w:sz w:val="19"/>
+        </w:rPr>
+      </w:pPr>
+      <w:r>
+        <w:rPr>
+          <w:rFonts w:ascii="Consolas" w:hAnsi="Consolas"/>
+          <w:sz w:val="19"/>
+        </w:rPr>
+        <w:t xml:space="preserve">                </w:t>
+      </w:r>
+      <w:r>
+        <w:rPr>
+          <w:rFonts w:ascii="Consolas" w:hAnsi="Consolas"/>
+          <w:sz w:val="19"/>
+        </w:rPr>
+        <w:t>Console.WriteLine($"Translation failed: {ex.Message}");</w:t>
+      </w:r>
+    </w:p>
+    <w:p>
+      <w:pPr>
+        <w:pStyle w:val="NoSpacing"/>
+        <w:rPr>
+          <w:rFonts w:ascii="Consolas" w:hAnsi="Consolas"/>
+          <w:sz w:val="19"/>
+        </w:rPr>
+      </w:pPr>
+      <w:r>
+        <w:rPr>
+          <w:rFonts w:ascii="Consolas" w:hAnsi="Consolas"/>
+          <w:sz w:val="19"/>
+        </w:rPr>
+        <w:t xml:space="preserve">            }</w:t>
+      </w:r>
+    </w:p>
+    <w:p>
+      <w:pPr>
+        <w:pStyle w:val="NoSpacing"/>
+        <w:rPr>
+          <w:rFonts w:ascii="Consolas" w:hAnsi="Consolas"/>
+          <w:sz w:val="19"/>
+        </w:rPr>
+      </w:pPr>
+      <w:r>
+        <w:rPr>
+          <w:rFonts w:ascii="Consolas" w:hAnsi="Consolas"/>
+          <w:sz w:val="19"/>
+        </w:rPr>
+        <w:t xml:space="preserve">        }</w:t>
+      </w:r>
+    </w:p>
+    <w:p>
+      <w:pPr>
+        <w:pStyle w:val="NoSpacing"/>
+        <w:rPr>
+          <w:rFonts w:ascii="Consolas" w:hAnsi="Consolas"/>
+          <w:sz w:val="19"/>
+        </w:rPr>
+      </w:pPr>
+      <w:r>
+        <w:rPr>
+          <w:rFonts w:ascii="Consolas" w:hAnsi="Consolas"/>
+          <w:sz w:val="19"/>
+        </w:rPr>
+        <w:t xml:space="preserve">    }</w:t>
+      </w:r>
+    </w:p>
+    <w:p>
+      <w:pPr>
+        <w:pStyle w:val="NoSpacing"/>
+        <w:rPr>
+          <w:rFonts w:ascii="Consolas" w:hAnsi="Consolas"/>
+          <w:sz w:val="19"/>
+        </w:rPr>
+      </w:pPr>
+      <w:r>
+        <w:rPr>
+          <w:rFonts w:ascii="Consolas" w:hAnsi="Consolas"/>
+          <w:sz w:val="19"/>
+        </w:rPr>
+        <w:t>}</w:t>
+      </w:r>
+    </w:p>
+    <w:p/>
+    <w:p>
+      <w:pPr>
+        <w:pStyle w:val="Heading2"/>
+      </w:pPr>
+      <w:r>
         <w:lastRenderedPageBreak/>
-        <w:t xml:space="preserve">          string modelId = "gemini-2.5-flash";</w:t>
-      </w:r>
-    </w:p>
-    <w:p>
-      <w:pPr>
-        <w:pStyle w:val="NoSpacing"/>
-        <w:rPr>
-          <w:rFonts w:ascii="Consolas" w:hAnsi="Consolas"/>
-          <w:sz w:val="19"/>
-        </w:rPr>
-      </w:pPr>
-    </w:p>
-    <w:p>
-      <w:pPr>
-        <w:pStyle w:val="NoSpacing"/>
-        <w:rPr>
-          <w:rFonts w:ascii="Consolas" w:hAnsi="Consolas"/>
-          <w:sz w:val="19"/>
-        </w:rPr>
-      </w:pPr>
-      <w:r>
-        <w:rPr>
-          <w:rFonts w:ascii="Consolas" w:hAnsi="Consolas"/>
-          <w:sz w:val="19"/>
-        </w:rPr>
-        <w:t xml:space="preserve">            builder.AddGoogleAIGeminiChatCompletion(modelId, apiKey);</w:t>
-      </w:r>
-    </w:p>
-    <w:p>
-      <w:pPr>
-        <w:pStyle w:val="NoSpacing"/>
-        <w:rPr>
-          <w:rFonts w:ascii="Consolas" w:hAnsi="Consolas"/>
-          <w:sz w:val="19"/>
-        </w:rPr>
-      </w:pPr>
-      <w:r>
-        <w:rPr>
-          <w:rFonts w:ascii="Consolas" w:hAnsi="Consolas"/>
-          <w:sz w:val="19"/>
-        </w:rPr>
-        <w:t xml:space="preserve">            Kernel kernel = builder.Build();</w:t>
-      </w:r>
-    </w:p>
-    <w:p>
-      <w:pPr>
-        <w:pStyle w:val="NoSpacing"/>
-        <w:rPr>
-          <w:rFonts w:ascii="Consolas" w:hAnsi="Consolas"/>
-          <w:sz w:val="19"/>
-        </w:rPr>
-      </w:pPr>
-    </w:p>
-    <w:p>
-      <w:pPr>
-        <w:pStyle w:val="NoSpacing"/>
-        <w:rPr>
-          <w:rFonts w:ascii="Consolas" w:hAnsi="Consolas"/>
-          <w:sz w:val="19"/>
-        </w:rPr>
-      </w:pPr>
-      <w:r>
-        <w:rPr>
-          <w:rFonts w:ascii="Consolas" w:hAnsi="Consolas"/>
-          <w:sz w:val="19"/>
-        </w:rPr>
-        <w:t xml:space="preserve">            // Step 2. Defind the unstrucured input and the prompt template</w:t>
-      </w:r>
-    </w:p>
-    <w:p>
-      <w:pPr>
-        <w:pStyle w:val="NoSpacing"/>
-        <w:rPr>
-          <w:rFonts w:ascii="Consolas" w:hAnsi="Consolas"/>
-          <w:sz w:val="19"/>
-        </w:rPr>
-      </w:pPr>
-      <w:r>
-        <w:rPr>
-          <w:rFonts w:ascii="Consolas" w:hAnsi="Consolas"/>
-          <w:sz w:val="19"/>
-        </w:rPr>
-        <w:t xml:space="preserve">            string unstructuredData = "We just hired Sarah Connor. She is 29 years old, works as a Cybersecurity Analyst, and her email is sarah.c@sky.net. She starts on Monday.";</w:t>
-      </w:r>
-    </w:p>
-    <w:p>
-      <w:pPr>
-        <w:pStyle w:val="NoSpacing"/>
-        <w:rPr>
-          <w:rFonts w:ascii="Consolas" w:hAnsi="Consolas"/>
-          <w:sz w:val="19"/>
-        </w:rPr>
-      </w:pPr>
-    </w:p>
-    <w:p>
-      <w:pPr>
-        <w:pStyle w:val="NoSpacing"/>
-        <w:rPr>
-          <w:rFonts w:ascii="Consolas" w:hAnsi="Consolas"/>
-          <w:sz w:val="19"/>
-        </w:rPr>
-      </w:pPr>
-      <w:r>
-        <w:rPr>
-          <w:rFonts w:ascii="Consolas" w:hAnsi="Consolas"/>
-          <w:sz w:val="19"/>
-        </w:rPr>
-        <w:t xml:space="preserve">            // Step 3. Define the strict prompt template</w:t>
-      </w:r>
-    </w:p>
-    <w:p>
-      <w:pPr>
-        <w:pStyle w:val="NoSpacing"/>
-        <w:rPr>
-          <w:rFonts w:ascii="Consolas" w:hAnsi="Consolas"/>
-          <w:sz w:val="19"/>
-        </w:rPr>
-      </w:pPr>
-      <w:r>
-        <w:rPr>
-          <w:rFonts w:ascii="Consolas" w:hAnsi="Consolas"/>
-          <w:sz w:val="19"/>
-        </w:rPr>
-        <w:t xml:space="preserve">            // We explicitly ban markdown blocks and converssational text to ensure raw JSON output</w:t>
-      </w:r>
-    </w:p>
-    <w:p>
-      <w:pPr>
-        <w:pStyle w:val="NoSpacing"/>
-        <w:rPr>
-          <w:rFonts w:ascii="Consolas" w:hAnsi="Consolas"/>
-          <w:sz w:val="19"/>
-        </w:rPr>
-      </w:pPr>
-      <w:r>
-        <w:rPr>
-          <w:rFonts w:ascii="Consolas" w:hAnsi="Consolas"/>
-          <w:sz w:val="19"/>
-        </w:rPr>
-        <w:t xml:space="preserve">            string promptTemplate = @"</w:t>
-      </w:r>
-    </w:p>
-    <w:p>
-      <w:pPr>
-        <w:pStyle w:val="NoSpacing"/>
-        <w:rPr>
-          <w:rFonts w:ascii="Consolas" w:hAnsi="Consolas"/>
-          <w:sz w:val="19"/>
-        </w:rPr>
-      </w:pPr>
-      <w:r>
-        <w:rPr>
-          <w:rFonts w:ascii="Consolas" w:hAnsi="Consolas"/>
-          <w:sz w:val="19"/>
-        </w:rPr>
-        <w:t>System: You are a strict data transformation agent. Your ONLY job is to convert natural language text into a valid JSON object.</w:t>
-      </w:r>
-    </w:p>
-    <w:p>
-      <w:pPr>
-        <w:pStyle w:val="NoSpacing"/>
-        <w:rPr>
-          <w:rFonts w:ascii="Consolas" w:hAnsi="Consolas"/>
-          <w:sz w:val="19"/>
-        </w:rPr>
-      </w:pPr>
-      <w:r>
-        <w:rPr>
-          <w:rFonts w:ascii="Consolas" w:hAnsi="Consolas"/>
-          <w:sz w:val="19"/>
-        </w:rPr>
-        <w:t>You must NOT output any markdown formatting (like ```json), no conversational text, and no explanations. Output raw JSON only.</w:t>
-      </w:r>
-    </w:p>
-    <w:p>
-      <w:pPr>
-        <w:pStyle w:val="NoSpacing"/>
-        <w:rPr>
-          <w:rFonts w:ascii="Consolas" w:hAnsi="Consolas"/>
-          <w:sz w:val="19"/>
-        </w:rPr>
-      </w:pPr>
-    </w:p>
-    <w:p>
-      <w:pPr>
-        <w:pStyle w:val="NoSpacing"/>
-        <w:rPr>
-          <w:rFonts w:ascii="Consolas" w:hAnsi="Consolas"/>
-          <w:sz w:val="19"/>
-        </w:rPr>
-      </w:pPr>
-      <w:r>
-        <w:rPr>
-          <w:rFonts w:ascii="Consolas" w:hAnsi="Consolas"/>
-          <w:sz w:val="19"/>
-        </w:rPr>
-        <w:t>The JSON must have the exact following keys:</w:t>
-      </w:r>
-    </w:p>
-    <w:p>
-      <w:pPr>
-        <w:pStyle w:val="NoSpacing"/>
-        <w:rPr>
-          <w:rFonts w:ascii="Consolas" w:hAnsi="Consolas"/>
-          <w:sz w:val="19"/>
-        </w:rPr>
-      </w:pPr>
-      <w:r>
-        <w:rPr>
-          <w:rFonts w:ascii="Consolas" w:hAnsi="Consolas"/>
-          <w:sz w:val="19"/>
-        </w:rPr>
-        <w:t>- FirstName (string)</w:t>
-      </w:r>
-    </w:p>
-    <w:p>
-      <w:pPr>
-        <w:pStyle w:val="NoSpacing"/>
-        <w:rPr>
-          <w:rFonts w:ascii="Consolas" w:hAnsi="Consolas"/>
-          <w:sz w:val="19"/>
-        </w:rPr>
-      </w:pPr>
-      <w:r>
-        <w:rPr>
-          <w:rFonts w:ascii="Consolas" w:hAnsi="Consolas"/>
-          <w:sz w:val="19"/>
-        </w:rPr>
-        <w:t>- LastName (string)</w:t>
-      </w:r>
-    </w:p>
-    <w:p>
-      <w:pPr>
-        <w:pStyle w:val="NoSpacing"/>
-        <w:rPr>
-          <w:rFonts w:ascii="Consolas" w:hAnsi="Consolas"/>
-          <w:sz w:val="19"/>
-        </w:rPr>
-      </w:pPr>
-      <w:r>
-        <w:rPr>
-          <w:rFonts w:ascii="Consolas" w:hAnsi="Consolas"/>
-          <w:sz w:val="19"/>
-        </w:rPr>
-        <w:t>- Age (integer)</w:t>
-      </w:r>
-    </w:p>
-    <w:p>
-      <w:pPr>
-        <w:pStyle w:val="NoSpacing"/>
-        <w:rPr>
-          <w:rFonts w:ascii="Consolas" w:hAnsi="Consolas"/>
-          <w:sz w:val="19"/>
-        </w:rPr>
-      </w:pPr>
-      <w:r>
-        <w:rPr>
-          <w:rFonts w:ascii="Consolas" w:hAnsi="Consolas"/>
-          <w:sz w:val="19"/>
-        </w:rPr>
-        <w:t>- JobTitle (string)</w:t>
-      </w:r>
-    </w:p>
-    <w:p>
-      <w:pPr>
-        <w:pStyle w:val="NoSpacing"/>
-        <w:rPr>
-          <w:rFonts w:ascii="Consolas" w:hAnsi="Consolas"/>
-          <w:sz w:val="19"/>
-        </w:rPr>
-      </w:pPr>
-      <w:r>
-        <w:rPr>
-          <w:rFonts w:ascii="Consolas" w:hAnsi="Consolas"/>
-          <w:sz w:val="19"/>
-        </w:rPr>
-        <w:t>- Email (string)</w:t>
-      </w:r>
-    </w:p>
-    <w:p>
-      <w:pPr>
-        <w:pStyle w:val="NoSpacing"/>
-        <w:rPr>
-          <w:rFonts w:ascii="Consolas" w:hAnsi="Consolas"/>
-          <w:sz w:val="19"/>
-        </w:rPr>
-      </w:pPr>
-    </w:p>
-    <w:p>
-      <w:pPr>
-        <w:pStyle w:val="NoSpacing"/>
-        <w:rPr>
-          <w:rFonts w:ascii="Consolas" w:hAnsi="Consolas"/>
-          <w:sz w:val="19"/>
-        </w:rPr>
-      </w:pPr>
-      <w:r>
-        <w:rPr>
-          <w:rFonts w:ascii="Consolas" w:hAnsi="Consolas"/>
-          <w:sz w:val="19"/>
-        </w:rPr>
-        <w:t>User: Translate this text into JSON:</w:t>
-      </w:r>
-    </w:p>
-    <w:p>
-      <w:pPr>
-        <w:pStyle w:val="NoSpacing"/>
-        <w:rPr>
-          <w:rFonts w:ascii="Consolas" w:hAnsi="Consolas"/>
-          <w:sz w:val="19"/>
-        </w:rPr>
-      </w:pPr>
-      <w:r>
-        <w:rPr>
-          <w:rFonts w:ascii="Consolas" w:hAnsi="Consolas"/>
-          <w:sz w:val="19"/>
-        </w:rPr>
-        <w:t>{{$input}}</w:t>
-      </w:r>
-    </w:p>
-    <w:p>
-      <w:pPr>
-        <w:pStyle w:val="NoSpacing"/>
-        <w:rPr>
-          <w:rFonts w:ascii="Consolas" w:hAnsi="Consolas"/>
-          <w:sz w:val="19"/>
-        </w:rPr>
-      </w:pPr>
-      <w:r>
-        <w:rPr>
-          <w:rFonts w:ascii="Consolas" w:hAnsi="Consolas"/>
-          <w:sz w:val="19"/>
-        </w:rPr>
-        <w:t>";</w:t>
-      </w:r>
-    </w:p>
-    <w:p>
-      <w:pPr>
-        <w:pStyle w:val="NoSpacing"/>
-        <w:rPr>
-          <w:rFonts w:ascii="Consolas" w:hAnsi="Consolas"/>
-          <w:sz w:val="19"/>
-        </w:rPr>
-      </w:pPr>
-      <w:r>
-        <w:rPr>
-          <w:rFonts w:ascii="Consolas" w:hAnsi="Consolas"/>
-          <w:sz w:val="19"/>
-        </w:rPr>
-        <w:t xml:space="preserve">            // Step 4. Configure Execution Settings to eliminate creativity</w:t>
-      </w:r>
-    </w:p>
-    <w:p>
-      <w:pPr>
-        <w:pStyle w:val="NoSpacing"/>
-        <w:rPr>
-          <w:rFonts w:ascii="Consolas" w:hAnsi="Consolas"/>
-          <w:sz w:val="19"/>
-        </w:rPr>
-      </w:pPr>
-      <w:r>
-        <w:rPr>
-          <w:rFonts w:ascii="Consolas" w:hAnsi="Consolas"/>
-          <w:sz w:val="19"/>
-        </w:rPr>
-        <w:t xml:space="preserve">            va</w:t>
-      </w:r>
-      <w:r>
-        <w:rPr>
-          <w:rFonts w:ascii="Consolas" w:hAnsi="Consolas"/>
-          <w:sz w:val="19"/>
-        </w:rPr>
+        <w:t>5. Code Walkthrough &amp; Explanations</w:t>
+      </w:r>
+    </w:p>
+    <w:p>
+      <w:r>
+        <w:rPr>
+          <w:b/>
+        </w:rPr>
+        <w:t>Step 1: Setup.</w:t>
+      </w:r>
+      <w:r>
+        <w:t xml:space="preserve"> The kernel setup follows the exact same pattern as Days 1 and 2: build, register the Gemini chat completion connector with an API key pulled from `GEMINI_API_KEY`, and build the kernel. By this point in the course the boilerplate should feel completely familiar — what changes lesson to lesson is what happens *after* the kernel is built.</w:t>
+      </w:r>
+    </w:p>
+    <w:p/>
+    <w:p>
+      <w:r>
+        <w:rPr>
+          <w:b/>
+        </w:rPr>
+        <w:t>Step 2: The Messy Input.</w:t>
+      </w:r>
+      <w:r>
+        <w:t xml:space="preserve"> `unstructuredData` is a plain, human-written sentence about a new hire. There's no structure to it at all — this is deliberately the kind of text a person might type into a form, not something a program could parse with string-splitting or regex reliably.</w:t>
+      </w:r>
+    </w:p>
+    <w:p/>
+    <w:p>
+      <w:r>
+        <w:rPr>
+          <w:b/>
+        </w:rPr>
+        <w:t>Step 3: The Strict Prompt Template.</w:t>
+      </w:r>
+      <w:r>
+        <w:t xml:space="preserve"> Notice the aggressive tone of the prompt. When building Transformation Agents, you have to explicitly tell the model what *not* to do. By default, LLMs try to be helpful and conversational. If we don't include instructions like "You must NOT output any markdown formatting" or "no conversational text, and no explanations," the model might return something like `Here's the JSON you requested: \`\`\`json { ... } \`\`\``, which will instantly crash a standard JSON parser like `System.Text.Json` in real backend code. The prompt also uses `{{$input}}` — the same variable-templating mechanic from Day 2 — to inject the unstructured sentence at render time.</w:t>
+      </w:r>
+    </w:p>
+    <w:p/>
+    <w:p>
+      <w:r>
+        <w:rPr>
+          <w:b/>
+        </w:rPr>
+        <w:t>Step 4: Execution Settings &amp; Temperature.</w:t>
+      </w:r>
+      <w:r>
+        <w:t xml:space="preserve"> To guarantee the model behaves like a strict parser rather than a creative writer, we instantiate `GeminiPromptExecutionSettings`. `Temperature` dictates the randomness of the model's responses: a high temperature (e.g., 0.8) makes output creative and varied, while a temperature of `0.0` forces the model to pick the most mathematically probable token every time. `TopP = 0.1` further narrows the pool of candidate tokens the model is allowed to sample from. For data extraction, translation, and JSON formatting, you almost always want a low temperature to ensure maximum stability and minimize hallucinated formatting.</w:t>
+      </w:r>
+    </w:p>
+    <w:p/>
+    <w:p>
+      <w:r>
+        <w:rPr>
+          <w:b/>
+        </w:rPr>
+        <w:t>Step 5: Injecting Execution Settings into KernelArguments.</w:t>
+      </w:r>
+      <w:r>
+        <w:t xml:space="preserve"> In Day 2, `KernelArguments` was used only to pass string variables into a template. Here, we pass `executionSettings` directly into the `KernelArguments` constructor, and then still add the `"input"` variable </w:t>
+      </w:r>
+      <w:r>
         <w:lastRenderedPageBreak/>
-        <w:t>r executionSettings = new GeminiPromptExecutionSettings()</w:t>
-      </w:r>
-    </w:p>
-    <w:p>
-      <w:pPr>
-        <w:pStyle w:val="NoSpacing"/>
-        <w:rPr>
-          <w:rFonts w:ascii="Consolas" w:hAnsi="Consolas"/>
-          <w:sz w:val="19"/>
-        </w:rPr>
-      </w:pPr>
-      <w:r>
-        <w:rPr>
-          <w:rFonts w:ascii="Consolas" w:hAnsi="Consolas"/>
-          <w:sz w:val="19"/>
-        </w:rPr>
-        <w:t xml:space="preserve">            {</w:t>
-      </w:r>
-    </w:p>
-    <w:p>
-      <w:pPr>
-        <w:pStyle w:val="NoSpacing"/>
-        <w:rPr>
-          <w:rFonts w:ascii="Consolas" w:hAnsi="Consolas"/>
-          <w:sz w:val="19"/>
-        </w:rPr>
-      </w:pPr>
-      <w:r>
-        <w:rPr>
-          <w:rFonts w:ascii="Consolas" w:hAnsi="Consolas"/>
-          <w:sz w:val="19"/>
-        </w:rPr>
-        <w:t xml:space="preserve">                Temperature = 0.0, // Eliminate randomness</w:t>
-      </w:r>
-    </w:p>
-    <w:p>
-      <w:pPr>
-        <w:pStyle w:val="NoSpacing"/>
-        <w:rPr>
-          <w:rFonts w:ascii="Consolas" w:hAnsi="Consolas"/>
-          <w:sz w:val="19"/>
-        </w:rPr>
-      </w:pPr>
-      <w:r>
-        <w:rPr>
-          <w:rFonts w:ascii="Consolas" w:hAnsi="Consolas"/>
-          <w:sz w:val="19"/>
-        </w:rPr>
-        <w:t xml:space="preserve">                TopP = 0.1</w:t>
-      </w:r>
-    </w:p>
-    <w:p>
-      <w:pPr>
-        <w:pStyle w:val="NoSpacing"/>
-        <w:rPr>
-          <w:rFonts w:ascii="Consolas" w:hAnsi="Consolas"/>
-          <w:sz w:val="19"/>
-        </w:rPr>
-      </w:pPr>
-      <w:r>
-        <w:rPr>
-          <w:rFonts w:ascii="Consolas" w:hAnsi="Consolas"/>
-          <w:sz w:val="19"/>
-        </w:rPr>
-        <w:t xml:space="preserve">            };</w:t>
-      </w:r>
-    </w:p>
-    <w:p>
-      <w:pPr>
-        <w:pStyle w:val="NoSpacing"/>
-        <w:rPr>
-          <w:rFonts w:ascii="Consolas" w:hAnsi="Consolas"/>
-          <w:sz w:val="19"/>
-        </w:rPr>
-      </w:pPr>
-    </w:p>
-    <w:p>
-      <w:pPr>
-        <w:pStyle w:val="NoSpacing"/>
-        <w:rPr>
-          <w:rFonts w:ascii="Consolas" w:hAnsi="Consolas"/>
-          <w:sz w:val="19"/>
-        </w:rPr>
-      </w:pPr>
-      <w:r>
-        <w:rPr>
-          <w:rFonts w:ascii="Consolas" w:hAnsi="Consolas"/>
-          <w:sz w:val="19"/>
-        </w:rPr>
-        <w:t xml:space="preserve">            // Step 5. Execute the prompt with the unstructured input</w:t>
-      </w:r>
-    </w:p>
-    <w:p>
-      <w:pPr>
-        <w:pStyle w:val="NoSpacing"/>
-        <w:rPr>
-          <w:rFonts w:ascii="Consolas" w:hAnsi="Consolas"/>
-          <w:sz w:val="19"/>
-        </w:rPr>
-      </w:pPr>
-      <w:r>
-        <w:rPr>
-          <w:rFonts w:ascii="Consolas" w:hAnsi="Consolas"/>
-          <w:sz w:val="19"/>
-        </w:rPr>
-        <w:t xml:space="preserve">            var arguments = new KernelArguments(executionSettings)</w:t>
-      </w:r>
-    </w:p>
-    <w:p>
-      <w:pPr>
-        <w:pStyle w:val="NoSpacing"/>
-        <w:rPr>
-          <w:rFonts w:ascii="Consolas" w:hAnsi="Consolas"/>
-          <w:sz w:val="19"/>
-        </w:rPr>
-      </w:pPr>
-      <w:r>
-        <w:rPr>
-          <w:rFonts w:ascii="Consolas" w:hAnsi="Consolas"/>
-          <w:sz w:val="19"/>
-        </w:rPr>
-        <w:t xml:space="preserve">            {</w:t>
-      </w:r>
-    </w:p>
-    <w:p>
-      <w:pPr>
-        <w:pStyle w:val="NoSpacing"/>
-        <w:rPr>
-          <w:rFonts w:ascii="Consolas" w:hAnsi="Consolas"/>
-          <w:sz w:val="19"/>
-        </w:rPr>
-      </w:pPr>
-      <w:r>
-        <w:rPr>
-          <w:rFonts w:ascii="Consolas" w:hAnsi="Consolas"/>
-          <w:sz w:val="19"/>
-        </w:rPr>
-        <w:t xml:space="preserve">                {  "input", unstructuredData }</w:t>
-      </w:r>
-    </w:p>
-    <w:p>
-      <w:pPr>
-        <w:pStyle w:val="NoSpacing"/>
-        <w:rPr>
-          <w:rFonts w:ascii="Consolas" w:hAnsi="Consolas"/>
-          <w:sz w:val="19"/>
-        </w:rPr>
-      </w:pPr>
-      <w:r>
-        <w:rPr>
-          <w:rFonts w:ascii="Consolas" w:hAnsi="Consolas"/>
-          <w:sz w:val="19"/>
-        </w:rPr>
-        <w:t xml:space="preserve">            };</w:t>
-      </w:r>
-    </w:p>
-    <w:p>
-      <w:pPr>
-        <w:pStyle w:val="NoSpacing"/>
-        <w:rPr>
-          <w:rFonts w:ascii="Consolas" w:hAnsi="Consolas"/>
-          <w:sz w:val="19"/>
-        </w:rPr>
-      </w:pPr>
-    </w:p>
-    <w:p>
-      <w:pPr>
-        <w:pStyle w:val="NoSpacing"/>
-        <w:rPr>
-          <w:rFonts w:ascii="Consolas" w:hAnsi="Consolas"/>
-          <w:sz w:val="19"/>
-        </w:rPr>
-      </w:pPr>
-      <w:r>
-        <w:rPr>
-          <w:rFonts w:ascii="Consolas" w:hAnsi="Consolas"/>
-          <w:sz w:val="19"/>
-        </w:rPr>
-        <w:t xml:space="preserve">            Console.WriteLine("Input Data:");</w:t>
-      </w:r>
-    </w:p>
-    <w:p>
-      <w:pPr>
-        <w:pStyle w:val="NoSpacing"/>
-        <w:rPr>
-          <w:rFonts w:ascii="Consolas" w:hAnsi="Consolas"/>
-          <w:sz w:val="19"/>
-        </w:rPr>
-      </w:pPr>
-      <w:r>
-        <w:rPr>
-          <w:rFonts w:ascii="Consolas" w:hAnsi="Consolas"/>
-          <w:sz w:val="19"/>
-        </w:rPr>
-        <w:t xml:space="preserve">            Console.WriteLine(unstructuredData);</w:t>
-      </w:r>
-    </w:p>
-    <w:p>
-      <w:pPr>
-        <w:pStyle w:val="NoSpacing"/>
-        <w:rPr>
-          <w:rFonts w:ascii="Consolas" w:hAnsi="Consolas"/>
-          <w:sz w:val="19"/>
-        </w:rPr>
-      </w:pPr>
-      <w:r>
-        <w:rPr>
-          <w:rFonts w:ascii="Consolas" w:hAnsi="Consolas"/>
-          <w:sz w:val="19"/>
-        </w:rPr>
-        <w:t xml:space="preserve">            Console.WriteLine("Transformatin natural language to JSON...");</w:t>
-      </w:r>
-    </w:p>
-    <w:p>
-      <w:pPr>
-        <w:pStyle w:val="NoSpacing"/>
-        <w:rPr>
-          <w:rFonts w:ascii="Consolas" w:hAnsi="Consolas"/>
-          <w:sz w:val="19"/>
-        </w:rPr>
-      </w:pPr>
-    </w:p>
-    <w:p>
-      <w:pPr>
-        <w:pStyle w:val="NoSpacing"/>
-        <w:rPr>
-          <w:rFonts w:ascii="Consolas" w:hAnsi="Consolas"/>
-          <w:sz w:val="19"/>
-        </w:rPr>
-      </w:pPr>
-      <w:r>
-        <w:rPr>
-          <w:rFonts w:ascii="Consolas" w:hAnsi="Consolas"/>
-          <w:sz w:val="19"/>
-        </w:rPr>
-        <w:t xml:space="preserve">            // Step 6. Execute the prompt</w:t>
-      </w:r>
-    </w:p>
-    <w:p>
-      <w:pPr>
-        <w:pStyle w:val="NoSpacing"/>
-        <w:rPr>
-          <w:rFonts w:ascii="Consolas" w:hAnsi="Consolas"/>
-          <w:sz w:val="19"/>
-        </w:rPr>
-      </w:pPr>
-      <w:r>
-        <w:rPr>
-          <w:rFonts w:ascii="Consolas" w:hAnsi="Consolas"/>
-          <w:sz w:val="19"/>
-        </w:rPr>
-        <w:t xml:space="preserve">            var result = await kernel.InvokePromptAsync(promptTemplate, arguments);</w:t>
-      </w:r>
-    </w:p>
-    <w:p>
-      <w:pPr>
-        <w:pStyle w:val="NoSpacing"/>
-        <w:rPr>
-          <w:rFonts w:ascii="Consolas" w:hAnsi="Consolas"/>
-          <w:sz w:val="19"/>
-        </w:rPr>
-      </w:pPr>
-    </w:p>
-    <w:p>
-      <w:pPr>
-        <w:pStyle w:val="NoSpacing"/>
-        <w:rPr>
-          <w:rFonts w:ascii="Consolas" w:hAnsi="Consolas"/>
-          <w:sz w:val="19"/>
-        </w:rPr>
-      </w:pPr>
-      <w:r>
-        <w:rPr>
-          <w:rFonts w:ascii="Consolas" w:hAnsi="Consolas"/>
-          <w:sz w:val="19"/>
-        </w:rPr>
-        <w:t xml:space="preserve">            // Step 7. Output the result</w:t>
-      </w:r>
-    </w:p>
-    <w:p>
-      <w:pPr>
-        <w:pStyle w:val="NoSpacing"/>
-        <w:rPr>
-          <w:rFonts w:ascii="Consolas" w:hAnsi="Consolas"/>
-          <w:sz w:val="19"/>
-        </w:rPr>
-      </w:pPr>
-      <w:r>
-        <w:rPr>
-          <w:rFonts w:ascii="Consolas" w:hAnsi="Consolas"/>
-          <w:sz w:val="19"/>
-        </w:rPr>
-        <w:t xml:space="preserve">            Console.WriteLine("--- STRING JSON OUTPUT ---");</w:t>
-      </w:r>
-    </w:p>
-    <w:p>
-      <w:pPr>
-        <w:pStyle w:val="NoSpacing"/>
-        <w:rPr>
-          <w:rFonts w:ascii="Consolas" w:hAnsi="Consolas"/>
-          <w:sz w:val="19"/>
-        </w:rPr>
-      </w:pPr>
-      <w:r>
-        <w:rPr>
-          <w:rFonts w:ascii="Consolas" w:hAnsi="Consolas"/>
-          <w:sz w:val="19"/>
-        </w:rPr>
-        <w:t xml:space="preserve">            Console.WriteLine(result.ToString());</w:t>
-      </w:r>
-    </w:p>
-    <w:p>
-      <w:pPr>
-        <w:pStyle w:val="NoSpacing"/>
-        <w:rPr>
-          <w:rFonts w:ascii="Consolas" w:hAnsi="Consolas"/>
-          <w:sz w:val="19"/>
-        </w:rPr>
-      </w:pPr>
-      <w:r>
-        <w:rPr>
-          <w:rFonts w:ascii="Consolas" w:hAnsi="Consolas"/>
-          <w:sz w:val="19"/>
-        </w:rPr>
-        <w:t xml:space="preserve">            Console.WriteLine("--------------------------");</w:t>
-      </w:r>
-    </w:p>
-    <w:p>
-      <w:pPr>
-        <w:pStyle w:val="NoSpacing"/>
-        <w:rPr>
-          <w:rFonts w:ascii="Consolas" w:hAnsi="Consolas"/>
-          <w:sz w:val="19"/>
-        </w:rPr>
-      </w:pPr>
-      <w:r>
-        <w:rPr>
-          <w:rFonts w:ascii="Consolas" w:hAnsi="Consolas"/>
-          <w:sz w:val="19"/>
-        </w:rPr>
-        <w:t xml:space="preserve">        }</w:t>
-      </w:r>
-    </w:p>
-    <w:p>
-      <w:pPr>
-        <w:pStyle w:val="NoSpacing"/>
-        <w:rPr>
-          <w:rFonts w:ascii="Consolas" w:hAnsi="Consolas"/>
-          <w:sz w:val="19"/>
-        </w:rPr>
-      </w:pPr>
-      <w:r>
-        <w:rPr>
-          <w:rFonts w:ascii="Consolas" w:hAnsi="Consolas"/>
-          <w:sz w:val="19"/>
-        </w:rPr>
-        <w:t xml:space="preserve">    }</w:t>
-      </w:r>
-    </w:p>
-    <w:p>
-      <w:pPr>
-        <w:pStyle w:val="NoSpacing"/>
-        <w:rPr>
-          <w:rFonts w:ascii="Consolas" w:hAnsi="Consolas"/>
-          <w:sz w:val="19"/>
-        </w:rPr>
-      </w:pPr>
-      <w:r>
-        <w:rPr>
-          <w:rFonts w:ascii="Consolas" w:hAnsi="Consolas"/>
-          <w:sz w:val="19"/>
-        </w:rPr>
-        <w:t>}</w:t>
-      </w:r>
-    </w:p>
-    <w:p/>
-    <w:p>
-      <w:pPr>
-        <w:pStyle w:val="Heading2"/>
-      </w:pPr>
-      <w:r>
-        <w:t>5. Code Walkthrough &amp; Explanations</w:t>
-      </w:r>
-    </w:p>
-    <w:p>
-      <w:r>
-        <w:rPr>
-          <w:b/>
-        </w:rPr>
-        <w:t>Step 1: Setup.</w:t>
-      </w:r>
-      <w:r>
-        <w:t xml:space="preserve"> The kernel setup follows the exact same pattern as Days 1 and 2: build, register the Gemini chat completion connector with an API key pulled from `GEMINI_API_KEY`, and build the kernel. By this point in the course the boilerplate should feel completely familiar — what changes lesson to lesson is what happens *after* the kernel is built.</w:t>
-      </w:r>
-    </w:p>
-    <w:p/>
-    <w:p>
-      <w:r>
-        <w:rPr>
-          <w:b/>
-        </w:rPr>
-        <w:t>Step 2: The Messy Input.</w:t>
-      </w:r>
-      <w:r>
-        <w:t xml:space="preserve"> `unstructuredData` is a plain, human-written sentence about a new hire. There's no structure to it at all — this is deliberately the kind of text a person might type into a form, not something a program could parse with string-splitting or regex reliably.</w:t>
-      </w:r>
-    </w:p>
-    <w:p/>
-    <w:p>
-      <w:r>
-        <w:rPr>
-          <w:b/>
-        </w:rPr>
-        <w:t>Step 3: The Strict Prompt Template.</w:t>
-      </w:r>
-      <w:r>
-        <w:t xml:space="preserve"> Notice the aggressive tone of the prompt. When building Transformation Agents, you have to explicitly te</w:t>
-      </w:r>
-      <w:r>
-        <w:lastRenderedPageBreak/>
-        <w:t>ll the model what *not* to do. By default, LLMs try to be helpful and conversational. If we don't include instructions like "You must NOT output any markdown formatting" or "no conversational text, and no explanations," the model might return something like `Here's the JSON you requested: \`\`\`json { ... } \`\`\``, which will instantly crash a standard JSON parser like `System.Text.Json` in real backend code. The prompt also uses `{{$input}}` — the same variable-templating mechanic from Day 2 — to inject the unstructured sentence at render time.</w:t>
-      </w:r>
-    </w:p>
-    <w:p/>
-    <w:p>
-      <w:r>
-        <w:rPr>
-          <w:b/>
-        </w:rPr>
-        <w:t>Step 4: Execution Settings &amp; Temperature.</w:t>
-      </w:r>
-      <w:r>
-        <w:t xml:space="preserve"> To guarantee the model behaves like a strict parser rather than a creative writer, we instantiate `GeminiPromptExecutionSettings`. `Temperature` dictates the randomness of the model's responses: a high temperature (e.g., 0.8) makes output creative and varied, while a temperature of `0.0` forces the model to pick the most mathematically probable token every time. `TopP = 0.1` further narrows the pool of candidate tokens the model is allowed to sample from. For data extraction, translation, and JSON formatting, you almost always want a low temperature to ensure maximum stability and minimize hallucinated formatting.</w:t>
-      </w:r>
-    </w:p>
-    <w:p/>
-    <w:p>
-      <w:r>
-        <w:rPr>
-          <w:b/>
-        </w:rPr>
-        <w:t>Step 5: Injecting Execution Settings into KernelArguments.</w:t>
-      </w:r>
-      <w:r>
-        <w:t xml:space="preserve"> In Day 2, `KernelArguments` was used only to pass string variables into a template. Here, we pass `executionSettings` directly into the `KernelArguments` constructor, and then still add the `"input"` variable using the same collection-initializer syntax. Semantic Kernel automatically applies these model-specific settings to the request before firing it off to the Gemini API — arguments and settings can travel together in one object.</w:t>
+        <w:t>using the same collection-initializer syntax. Semantic Kernel automatically applies these model-specific settings to the request before firing it off to the Gemini API — arguments and settings can travel together in one object.</w:t>
       </w:r>
     </w:p>
     <w:p/>

</xml_diff>